<commit_message>
Align repository with AppDeploy planner flow
</commit_message>
<xml_diff>
--- a/docs/deliverables/docx/03_AI_Application_Deployment_Control_Optimization_Strategy.docx
+++ b/docs/deliverables/docx/03_AI_Application_Deployment_Control_Optimization_Strategy.docx
@@ -2,7 +2,7 @@
 <file path=word/document.xml><?xml version="1.0" encoding="utf-8"?>
 <w:document xmlns:w="http://schemas.openxmlformats.org/wordprocessingml/2006/main" xmlns:m="http://schemas.openxmlformats.org/officeDocument/2006/math" xmlns:r="http://schemas.openxmlformats.org/officeDocument/2006/relationships" xmlns:o="urn:schemas-microsoft-com:office:office" xmlns:v="urn:schemas-microsoft-com:vml" xmlns:w10="urn:schemas-microsoft-com:office:word" xmlns:a="http://schemas.openxmlformats.org/drawingml/2006/main" xmlns:pic="http://schemas.openxmlformats.org/drawingml/2006/picture" xmlns:wp="http://schemas.openxmlformats.org/drawingml/2006/wordprocessingDrawing">
   <w:body>
-    <w:bookmarkStart w:id="19" w:name="ai-응용-배포제어-추론-최적화-전략-설계서"/>
+    <w:bookmarkStart w:id="22" w:name="ai-응용-배포제어-추론-최적화-전략-설계서"/>
     <w:p>
       <w:pPr>
         <w:pStyle w:val="Heading1"/>
@@ -19,7 +19,7 @@
         <w:t xml:space="preserve">English title: AI Application Deployment and Control Optimization Strategy</w:t>
       </w:r>
     </w:p>
-    <w:bookmarkStart w:id="9" w:name="설계-목적"/>
+    <w:bookmarkStart w:id="12" w:name="설계-목적"/>
     <w:p>
       <w:pPr>
         <w:pStyle w:val="Heading2"/>
@@ -44,8 +44,63 @@
         <w:t xml:space="preserve">플래너는 VM을 직접 생성하거나 최종 Target을 선택하지 않습니다. AppDeploy가 App Spec, Target Profile, readiness, Runtime Adapter를 기준으로 실제 배포 대상을 선택하고 실행합니다.</w:t>
       </w:r>
     </w:p>
-    <w:bookmarkEnd w:id="9"/>
-    <w:bookmarkStart w:id="10" w:name="구성"/>
+    <w:p>
+      <w:pPr>
+        <w:pStyle w:val="CaptionedFigure"/>
+      </w:pPr>
+      <w:r>
+        <w:drawing>
+          <wp:inline>
+            <wp:extent cx="5334000" cy="2726266"/>
+            <wp:effectExtent b="0" l="0" r="0" t="0"/>
+            <wp:docPr descr="CPU/GPU 자원 요구와 AppDeploy Target 선택 흐름" title="" id="10" name="Picture"/>
+            <a:graphic>
+              <a:graphicData uri="http://schemas.openxmlformats.org/drawingml/2006/picture">
+                <pic:pic>
+                  <pic:nvPicPr>
+                    <pic:cNvPr descr="../images/cpu_gpu_placement_flow.png" id="11" name="Picture"/>
+                    <pic:cNvPicPr>
+                      <a:picLocks noChangeArrowheads="1" noChangeAspect="1"/>
+                    </pic:cNvPicPr>
+                  </pic:nvPicPr>
+                  <pic:blipFill>
+                    <a:blip r:embed="rId9"/>
+                    <a:stretch>
+                      <a:fillRect/>
+                    </a:stretch>
+                  </pic:blipFill>
+                  <pic:spPr bwMode="auto">
+                    <a:xfrm>
+                      <a:off x="0" y="0"/>
+                      <a:ext cx="5334000" cy="2726266"/>
+                    </a:xfrm>
+                    <a:prstGeom prst="rect">
+                      <a:avLst/>
+                    </a:prstGeom>
+                    <a:noFill/>
+                    <a:ln w="9525">
+                      <a:noFill/>
+                      <a:headEnd/>
+                      <a:tailEnd/>
+                    </a:ln>
+                  </pic:spPr>
+                </pic:pic>
+              </a:graphicData>
+            </a:graphic>
+          </wp:inline>
+        </w:drawing>
+      </w:r>
+    </w:p>
+    <w:p>
+      <w:pPr>
+        <w:pStyle w:val="ImageCaption"/>
+      </w:pPr>
+      <w:r>
+        <w:t xml:space="preserve">CPU/GPU 자원 요구와 AppDeploy Target 선택 흐름</w:t>
+      </w:r>
+    </w:p>
+    <w:bookmarkEnd w:id="12"/>
+    <w:bookmarkStart w:id="13" w:name="구성"/>
     <w:p>
       <w:pPr>
         <w:pStyle w:val="Heading2"/>
@@ -189,8 +244,8 @@
         </w:tc>
       </w:tr>
     </w:tbl>
-    <w:bookmarkEnd w:id="10"/>
-    <w:bookmarkStart w:id="11" w:name="처리-흐름"/>
+    <w:bookmarkEnd w:id="13"/>
+    <w:bookmarkStart w:id="14" w:name="처리-흐름"/>
     <w:p>
       <w:pPr>
         <w:pStyle w:val="Heading2"/>
@@ -273,8 +328,8 @@
         <w:t xml:space="preserve">  -&gt; 결과와 재시도 권고 반환</w:t>
       </w:r>
     </w:p>
-    <w:bookmarkEnd w:id="11"/>
-    <w:bookmarkStart w:id="12" w:name="deployment-manifest"/>
+    <w:bookmarkEnd w:id="14"/>
+    <w:bookmarkStart w:id="15" w:name="deployment-manifest"/>
     <w:p>
       <w:pPr>
         <w:pStyle w:val="Heading2"/>
@@ -457,8 +512,8 @@
         <w:t xml:space="preserve">는 선택 사항이며 Target hint로만 사용합니다. 최종 Target 선택은 AppDeploy가 수행합니다.</w:t>
       </w:r>
     </w:p>
-    <w:bookmarkEnd w:id="12"/>
-    <w:bookmarkStart w:id="13" w:name="추론-최적화-전략"/>
+    <w:bookmarkEnd w:id="15"/>
+    <w:bookmarkStart w:id="16" w:name="추론-최적화-전략"/>
     <w:p>
       <w:pPr>
         <w:pStyle w:val="Heading2"/>
@@ -661,8 +716,8 @@
         <w:t xml:space="preserve">LLM의 출력은 최종 사실이 아니라 후보 계획입니다. Go Guard를 통과한 요구 envelope만 AppDeploy로 전달됩니다.</w:t>
       </w:r>
     </w:p>
-    <w:bookmarkEnd w:id="13"/>
-    <w:bookmarkStart w:id="14" w:name="go-guard-정책"/>
+    <w:bookmarkEnd w:id="16"/>
+    <w:bookmarkStart w:id="17" w:name="go-guard-정책"/>
     <w:p>
       <w:pPr>
         <w:pStyle w:val="Heading2"/>
@@ -784,8 +839,8 @@
         <w:t xml:space="preserve">검증 실패 시 AppDeploy API를 호출하지 않습니다. LLM 오류를 규칙 기반 성공 결과로 대체하지 않습니다.</w:t>
       </w:r>
     </w:p>
-    <w:bookmarkEnd w:id="14"/>
-    <w:bookmarkStart w:id="15" w:name="상태-확인과-재시도"/>
+    <w:bookmarkEnd w:id="17"/>
+    <w:bookmarkStart w:id="18" w:name="상태-확인과-재시도"/>
     <w:p>
       <w:pPr>
         <w:pStyle w:val="Heading2"/>
@@ -896,8 +951,8 @@
         <w:t xml:space="preserve">가 명시된 오류만 재시도 가능으로 판단하고, 배포 생성 POST는 자동 반복하지 않습니다.</w:t>
       </w:r>
     </w:p>
-    <w:bookmarkEnd w:id="15"/>
-    <w:bookmarkStart w:id="16" w:name="구현-위치"/>
+    <w:bookmarkEnd w:id="18"/>
+    <w:bookmarkStart w:id="19" w:name="구현-위치"/>
     <w:p>
       <w:pPr>
         <w:pStyle w:val="Heading2"/>
@@ -1119,8 +1174,8 @@
         </w:tc>
       </w:tr>
     </w:tbl>
-    <w:bookmarkEnd w:id="16"/>
-    <w:bookmarkStart w:id="17" w:name="실행-예시"/>
+    <w:bookmarkEnd w:id="19"/>
+    <w:bookmarkStart w:id="20" w:name="실행-예시"/>
     <w:p>
       <w:pPr>
         <w:pStyle w:val="Heading2"/>
@@ -1205,8 +1260,8 @@
         <w:t xml:space="preserve">실제 성공 결과를 얻으려면 LLM endpoint와 AppDeploy 서버가 모두 실행 중이고 App Version 및 Target Profile이 AppDeploy에 등록되어 있어야 합니다.</w:t>
       </w:r>
     </w:p>
-    <w:bookmarkEnd w:id="17"/>
-    <w:bookmarkStart w:id="18" w:name="범위와-한계"/>
+    <w:bookmarkEnd w:id="20"/>
+    <w:bookmarkStart w:id="21" w:name="범위와-한계"/>
     <w:p>
       <w:pPr>
         <w:pStyle w:val="Heading2"/>
@@ -1263,14 +1318,12 @@
         <w:t xml:space="preserve">1차년도 범위는 VM 기반이며 Kubernetes 배포를 산출물로 주장하지 않습니다.</w:t>
       </w:r>
     </w:p>
-    <w:bookmarkEnd w:id="18"/>
-    <w:bookmarkEnd w:id="19"/>
+    <w:bookmarkEnd w:id="21"/>
+    <w:bookmarkEnd w:id="22"/>
     <w:sectPr>
       <w:footnotePr>
         <w:numRestart w:val="eachSect"/>
       </w:footnotePr>
-      <w:pgSz w:w="11906" w:h="16838"/>
-      <w:pgMar w:top="1134" w:bottom="1134" w:left="1134" w:right="1134"/>
     </w:sectPr>
   </w:body>
 </w:document>
@@ -2260,7 +2313,7 @@
       <w:color w:themeColor="accent1" w:themeShade="BF" w:val="365F91"/>
     </w:rPr>
   </w:style>
-  <w:style w:customStyle="1" w:styleId="SourceCode" w:type="paragraph">
+  <w:style w:type="paragraph" w:customStyle="1" w:styleId="SourceCode">
     <w:name w:val="Source Code"/>
     <w:basedOn w:val="Normal"/>
     <w:link w:val="VerbatimChar"/>
@@ -2268,7 +2321,7 @@
       <w:wordWrap w:val="off"/>
     </w:pPr>
   </w:style>
-  <w:style w:customStyle="1" w:styleId="KeywordTok" w:type="character">
+  <w:style w:type="character" w:customStyle="1" w:styleId="KeywordTok">
     <w:name w:val="KeywordTok"/>
     <w:basedOn w:val="VerbatimChar"/>
     <w:rPr>
@@ -2276,77 +2329,77 @@
       <w:color w:val="007020"/>
     </w:rPr>
   </w:style>
-  <w:style w:customStyle="1" w:styleId="DataTypeTok" w:type="character">
+  <w:style w:type="character" w:customStyle="1" w:styleId="DataTypeTok">
     <w:name w:val="DataTypeTok"/>
     <w:basedOn w:val="VerbatimChar"/>
     <w:rPr>
       <w:color w:val="902000"/>
     </w:rPr>
   </w:style>
-  <w:style w:customStyle="1" w:styleId="DecValTok" w:type="character">
+  <w:style w:type="character" w:customStyle="1" w:styleId="DecValTok">
     <w:name w:val="DecValTok"/>
     <w:basedOn w:val="VerbatimChar"/>
     <w:rPr>
       <w:color w:val="40a070"/>
     </w:rPr>
   </w:style>
-  <w:style w:customStyle="1" w:styleId="BaseNTok" w:type="character">
+  <w:style w:type="character" w:customStyle="1" w:styleId="BaseNTok">
     <w:name w:val="BaseNTok"/>
     <w:basedOn w:val="VerbatimChar"/>
     <w:rPr>
       <w:color w:val="40a070"/>
     </w:rPr>
   </w:style>
-  <w:style w:customStyle="1" w:styleId="FloatTok" w:type="character">
+  <w:style w:type="character" w:customStyle="1" w:styleId="FloatTok">
     <w:name w:val="FloatTok"/>
     <w:basedOn w:val="VerbatimChar"/>
     <w:rPr>
       <w:color w:val="40a070"/>
     </w:rPr>
   </w:style>
-  <w:style w:customStyle="1" w:styleId="ConstantTok" w:type="character">
+  <w:style w:type="character" w:customStyle="1" w:styleId="ConstantTok">
     <w:name w:val="ConstantTok"/>
     <w:basedOn w:val="VerbatimChar"/>
     <w:rPr>
       <w:color w:val="880000"/>
     </w:rPr>
   </w:style>
-  <w:style w:customStyle="1" w:styleId="CharTok" w:type="character">
+  <w:style w:type="character" w:customStyle="1" w:styleId="CharTok">
     <w:name w:val="CharTok"/>
     <w:basedOn w:val="VerbatimChar"/>
     <w:rPr>
       <w:color w:val="4070a0"/>
     </w:rPr>
   </w:style>
-  <w:style w:customStyle="1" w:styleId="SpecialCharTok" w:type="character">
+  <w:style w:type="character" w:customStyle="1" w:styleId="SpecialCharTok">
     <w:name w:val="SpecialCharTok"/>
     <w:basedOn w:val="VerbatimChar"/>
     <w:rPr>
       <w:color w:val="4070a0"/>
     </w:rPr>
   </w:style>
-  <w:style w:customStyle="1" w:styleId="StringTok" w:type="character">
+  <w:style w:type="character" w:customStyle="1" w:styleId="StringTok">
     <w:name w:val="StringTok"/>
     <w:basedOn w:val="VerbatimChar"/>
     <w:rPr>
       <w:color w:val="4070a0"/>
     </w:rPr>
   </w:style>
-  <w:style w:customStyle="1" w:styleId="VerbatimStringTok" w:type="character">
+  <w:style w:type="character" w:customStyle="1" w:styleId="VerbatimStringTok">
     <w:name w:val="VerbatimStringTok"/>
     <w:basedOn w:val="VerbatimChar"/>
     <w:rPr>
       <w:color w:val="4070a0"/>
     </w:rPr>
   </w:style>
-  <w:style w:customStyle="1" w:styleId="SpecialStringTok" w:type="character">
+  <w:style w:type="character" w:customStyle="1" w:styleId="SpecialStringTok">
     <w:name w:val="SpecialStringTok"/>
     <w:basedOn w:val="VerbatimChar"/>
     <w:rPr>
       <w:color w:val="bb6688"/>
     </w:rPr>
   </w:style>
-  <w:style w:customStyle="1" w:styleId="ImportTok" w:type="character">
+  <w:style w:type="character" w:customStyle="1" w:styleId="ImportTok">
     <w:name w:val="ImportTok"/>
     <w:basedOn w:val="VerbatimChar"/>
     <w:rPr>
@@ -2354,7 +2407,7 @@
       <w:color w:val="008000"/>
     </w:rPr>
   </w:style>
-  <w:style w:customStyle="1" w:styleId="CommentTok" w:type="character">
+  <w:style w:type="character" w:customStyle="1" w:styleId="CommentTok">
     <w:name w:val="CommentTok"/>
     <w:basedOn w:val="VerbatimChar"/>
     <w:rPr>
@@ -2362,7 +2415,7 @@
       <w:color w:val="60a0b0"/>
     </w:rPr>
   </w:style>
-  <w:style w:customStyle="1" w:styleId="DocumentationTok" w:type="character">
+  <w:style w:type="character" w:customStyle="1" w:styleId="DocumentationTok">
     <w:name w:val="DocumentationTok"/>
     <w:basedOn w:val="VerbatimChar"/>
     <w:rPr>
@@ -2370,7 +2423,7 @@
       <w:color w:val="ba2121"/>
     </w:rPr>
   </w:style>
-  <w:style w:customStyle="1" w:styleId="AnnotationTok" w:type="character">
+  <w:style w:type="character" w:customStyle="1" w:styleId="AnnotationTok">
     <w:name w:val="AnnotationTok"/>
     <w:basedOn w:val="VerbatimChar"/>
     <w:rPr>
@@ -2379,7 +2432,7 @@
       <w:color w:val="60a0b0"/>
     </w:rPr>
   </w:style>
-  <w:style w:customStyle="1" w:styleId="CommentVarTok" w:type="character">
+  <w:style w:type="character" w:customStyle="1" w:styleId="CommentVarTok">
     <w:name w:val="CommentVarTok"/>
     <w:basedOn w:val="VerbatimChar"/>
     <w:rPr>
@@ -2388,28 +2441,28 @@
       <w:color w:val="60a0b0"/>
     </w:rPr>
   </w:style>
-  <w:style w:customStyle="1" w:styleId="OtherTok" w:type="character">
+  <w:style w:type="character" w:customStyle="1" w:styleId="OtherTok">
     <w:name w:val="OtherTok"/>
     <w:basedOn w:val="VerbatimChar"/>
     <w:rPr>
       <w:color w:val="007020"/>
     </w:rPr>
   </w:style>
-  <w:style w:customStyle="1" w:styleId="FunctionTok" w:type="character">
+  <w:style w:type="character" w:customStyle="1" w:styleId="FunctionTok">
     <w:name w:val="FunctionTok"/>
     <w:basedOn w:val="VerbatimChar"/>
     <w:rPr>
       <w:color w:val="06287e"/>
     </w:rPr>
   </w:style>
-  <w:style w:customStyle="1" w:styleId="VariableTok" w:type="character">
+  <w:style w:type="character" w:customStyle="1" w:styleId="VariableTok">
     <w:name w:val="VariableTok"/>
     <w:basedOn w:val="VerbatimChar"/>
     <w:rPr>
       <w:color w:val="19177c"/>
     </w:rPr>
   </w:style>
-  <w:style w:customStyle="1" w:styleId="ControlFlowTok" w:type="character">
+  <w:style w:type="character" w:customStyle="1" w:styleId="ControlFlowTok">
     <w:name w:val="ControlFlowTok"/>
     <w:basedOn w:val="VerbatimChar"/>
     <w:rPr>
@@ -2417,45 +2470,45 @@
       <w:color w:val="007020"/>
     </w:rPr>
   </w:style>
-  <w:style w:customStyle="1" w:styleId="OperatorTok" w:type="character">
+  <w:style w:type="character" w:customStyle="1" w:styleId="OperatorTok">
     <w:name w:val="OperatorTok"/>
     <w:basedOn w:val="VerbatimChar"/>
     <w:rPr>
       <w:color w:val="666666"/>
     </w:rPr>
   </w:style>
-  <w:style w:customStyle="1" w:styleId="BuiltInTok" w:type="character">
+  <w:style w:type="character" w:customStyle="1" w:styleId="BuiltInTok">
     <w:name w:val="BuiltInTok"/>
     <w:basedOn w:val="VerbatimChar"/>
     <w:rPr>
       <w:color w:val="008000"/>
     </w:rPr>
   </w:style>
-  <w:style w:customStyle="1" w:styleId="ExtensionTok" w:type="character">
+  <w:style w:type="character" w:customStyle="1" w:styleId="ExtensionTok">
     <w:name w:val="ExtensionTok"/>
     <w:basedOn w:val="VerbatimChar"/>
     <w:rPr/>
   </w:style>
-  <w:style w:customStyle="1" w:styleId="PreprocessorTok" w:type="character">
+  <w:style w:type="character" w:customStyle="1" w:styleId="PreprocessorTok">
     <w:name w:val="PreprocessorTok"/>
     <w:basedOn w:val="VerbatimChar"/>
     <w:rPr>
       <w:color w:val="bc7a00"/>
     </w:rPr>
   </w:style>
-  <w:style w:customStyle="1" w:styleId="AttributeTok" w:type="character">
+  <w:style w:type="character" w:customStyle="1" w:styleId="AttributeTok">
     <w:name w:val="AttributeTok"/>
     <w:basedOn w:val="VerbatimChar"/>
     <w:rPr>
       <w:color w:val="7d9029"/>
     </w:rPr>
   </w:style>
-  <w:style w:customStyle="1" w:styleId="RegionMarkerTok" w:type="character">
+  <w:style w:type="character" w:customStyle="1" w:styleId="RegionMarkerTok">
     <w:name w:val="RegionMarkerTok"/>
     <w:basedOn w:val="VerbatimChar"/>
     <w:rPr/>
   </w:style>
-  <w:style w:customStyle="1" w:styleId="InformationTok" w:type="character">
+  <w:style w:type="character" w:customStyle="1" w:styleId="InformationTok">
     <w:name w:val="InformationTok"/>
     <w:basedOn w:val="VerbatimChar"/>
     <w:rPr>
@@ -2464,7 +2517,7 @@
       <w:color w:val="60a0b0"/>
     </w:rPr>
   </w:style>
-  <w:style w:customStyle="1" w:styleId="WarningTok" w:type="character">
+  <w:style w:type="character" w:customStyle="1" w:styleId="WarningTok">
     <w:name w:val="WarningTok"/>
     <w:basedOn w:val="VerbatimChar"/>
     <w:rPr>
@@ -2473,7 +2526,7 @@
       <w:color w:val="60a0b0"/>
     </w:rPr>
   </w:style>
-  <w:style w:customStyle="1" w:styleId="AlertTok" w:type="character">
+  <w:style w:type="character" w:customStyle="1" w:styleId="AlertTok">
     <w:name w:val="AlertTok"/>
     <w:basedOn w:val="VerbatimChar"/>
     <w:rPr>
@@ -2481,7 +2534,7 @@
       <w:color w:val="ff0000"/>
     </w:rPr>
   </w:style>
-  <w:style w:customStyle="1" w:styleId="ErrorTok" w:type="character">
+  <w:style w:type="character" w:customStyle="1" w:styleId="ErrorTok">
     <w:name w:val="ErrorTok"/>
     <w:basedOn w:val="VerbatimChar"/>
     <w:rPr>
@@ -2489,7 +2542,7 @@
       <w:color w:val="ff0000"/>
     </w:rPr>
   </w:style>
-  <w:style w:customStyle="1" w:styleId="NormalTok" w:type="character">
+  <w:style w:type="character" w:customStyle="1" w:styleId="NormalTok">
     <w:name w:val="NormalTok"/>
     <w:basedOn w:val="VerbatimChar"/>
     <w:rPr/>

</xml_diff>

<commit_message>
Add dual Go Guard planner validation
</commit_message>
<xml_diff>
--- a/docs/deliverables/docx/03_AI_Application_Deployment_Control_Optimization_Strategy.docx
+++ b/docs/deliverables/docx/03_AI_Application_Deployment_Control_Optimization_Strategy.docx
@@ -2,7 +2,7 @@
 <file path=word/document.xml><?xml version="1.0" encoding="utf-8"?>
 <w:document xmlns:w="http://schemas.openxmlformats.org/wordprocessingml/2006/main" xmlns:m="http://schemas.openxmlformats.org/officeDocument/2006/math" xmlns:r="http://schemas.openxmlformats.org/officeDocument/2006/relationships" xmlns:o="urn:schemas-microsoft-com:office:office" xmlns:v="urn:schemas-microsoft-com:vml" xmlns:w10="urn:schemas-microsoft-com:office:word" xmlns:a="http://schemas.openxmlformats.org/drawingml/2006/main" xmlns:pic="http://schemas.openxmlformats.org/drawingml/2006/picture" xmlns:wp="http://schemas.openxmlformats.org/drawingml/2006/wordprocessingDrawing">
   <w:body>
-    <w:bookmarkStart w:id="22" w:name="ai-응용-배포제어-추론-최적화-전략-설계서"/>
+    <w:bookmarkStart w:id="24" w:name="ai-응용-배포제어-추론-최적화-전략-설계서"/>
     <w:p>
       <w:pPr>
         <w:pStyle w:val="Heading1"/>
@@ -33,7 +33,7 @@
         <w:pStyle w:val="FirstParagraph"/>
       </w:pPr>
       <w:r>
-        <w:t xml:space="preserve">본 설계는 자연어 AI 응용 배포 요구를 LLM으로 분석하고, CPU·메모리·GPU·디스크·accelerator 요구량을 구조화한 뒤 AppDeploy에 전달하는 Go 기반 Deployment Planner를 정의합니다.</w:t>
+        <w:t xml:space="preserve">본 설계는 자연어 AI 응용 배포 요구를 Go Request Guard로 선검증하고 LLM으로 분석한 뒤, CPU·메모리·GPU·디스크·accelerator 요구량을 구조화하여 Go Manifest Guard를 거쳐 AppDeploy에 전달하는 Go 기반 Deployment Planner를 정의합니다.</w:t>
       </w:r>
     </w:p>
     <w:p>
@@ -51,14 +51,14 @@
       <w:r>
         <w:drawing>
           <wp:inline>
-            <wp:extent cx="5334000" cy="2726266"/>
+            <wp:extent cx="5334000" cy="3081866"/>
             <wp:effectExtent b="0" l="0" r="0" t="0"/>
-            <wp:docPr descr="CPU/GPU 자원 요구와 AppDeploy Target 선택 흐름" title="" id="10" name="Picture"/>
+            <wp:docPr descr="이중 Go Guard 기반 LLM Planner와 AppDeploy 연계 흐름" title="" id="10" name="Picture"/>
             <a:graphic>
               <a:graphicData uri="http://schemas.openxmlformats.org/drawingml/2006/picture">
                 <pic:pic>
                   <pic:nvPicPr>
-                    <pic:cNvPr descr="../images/cpu_gpu_placement_flow.png" id="11" name="Picture"/>
+                    <pic:cNvPr descr="../images/service_control_architecture.png" id="11" name="Picture"/>
                     <pic:cNvPicPr>
                       <a:picLocks noChangeArrowheads="1" noChangeAspect="1"/>
                     </pic:cNvPicPr>
@@ -72,7 +72,7 @@
                   <pic:spPr bwMode="auto">
                     <a:xfrm>
                       <a:off x="0" y="0"/>
-                      <a:ext cx="5334000" cy="2726266"/>
+                      <a:ext cx="5334000" cy="3081866"/>
                     </a:xfrm>
                     <a:prstGeom prst="rect">
                       <a:avLst/>
@@ -96,7 +96,7 @@
         <w:pStyle w:val="ImageCaption"/>
       </w:pPr>
       <w:r>
-        <w:t xml:space="preserve">CPU/GPU 자원 요구와 AppDeploy Target 선택 흐름</w:t>
+        <w:t xml:space="preserve">이중 Go Guard 기반 LLM Planner와 AppDeploy 연계 흐름</w:t>
       </w:r>
     </w:p>
     <w:bookmarkEnd w:id="12"/>
@@ -155,18 +155,18 @@
               <w:pStyle w:val="Compact"/>
             </w:pPr>
             <w:r>
-              <w:t xml:space="preserve">LLM Planner</w:t>
-            </w:r>
-          </w:p>
-        </w:tc>
-        <w:tc>
-          <w:tcPr/>
-          <w:p>
-            <w:pPr>
-              <w:pStyle w:val="Compact"/>
-            </w:pPr>
-            <w:r>
-              <w:t xml:space="preserve">자연어 요구 분석과 Deployment Manifest 생성</w:t>
+              <w:t xml:space="preserve">Go Request Guard</w:t>
+            </w:r>
+          </w:p>
+        </w:tc>
+        <w:tc>
+          <w:tcPr/>
+          <w:p>
+            <w:pPr>
+              <w:pStyle w:val="Compact"/>
+            </w:pPr>
+            <w:r>
+              <w:t xml:space="preserve">LLM 호출 전 요청자, 1차년도 VM 범위, 민감 파라미터 검증</w:t>
             </w:r>
           </w:p>
         </w:tc>
@@ -179,7 +179,31 @@
               <w:pStyle w:val="Compact"/>
             </w:pPr>
             <w:r>
-              <w:t xml:space="preserve">Go Guard</w:t>
+              <w:t xml:space="preserve">LLM Planner</w:t>
+            </w:r>
+          </w:p>
+        </w:tc>
+        <w:tc>
+          <w:tcPr/>
+          <w:p>
+            <w:pPr>
+              <w:pStyle w:val="Compact"/>
+            </w:pPr>
+            <w:r>
+              <w:t xml:space="preserve">자연어 요구 분석과 Deployment Manifest 생성</w:t>
+            </w:r>
+          </w:p>
+        </w:tc>
+      </w:tr>
+      <w:tr>
+        <w:tc>
+          <w:tcPr/>
+          <w:p>
+            <w:pPr>
+              <w:pStyle w:val="Compact"/>
+            </w:pPr>
+            <w:r>
+              <w:t xml:space="preserve">Go Manifest Guard</w:t>
             </w:r>
           </w:p>
         </w:tc>
@@ -271,6 +295,15 @@
         <w:rPr>
           <w:rStyle w:val="VerbatimChar"/>
         </w:rPr>
+        <w:t xml:space="preserve">  -&gt; Go Request Guard 승인 또는 거부</w:t>
+      </w:r>
+      <w:r>
+        <w:br/>
+      </w:r>
+      <w:r>
+        <w:rPr>
+          <w:rStyle w:val="VerbatimChar"/>
+        </w:rPr>
         <w:t xml:space="preserve">  -&gt; 실제 LLM endpoint 호출</w:t>
       </w:r>
       <w:r>
@@ -298,7 +331,7 @@
         <w:rPr>
           <w:rStyle w:val="VerbatimChar"/>
         </w:rPr>
-        <w:t xml:space="preserve">  -&gt; Go Guard 승인 또는 거부</w:t>
+        <w:t xml:space="preserve">  -&gt; Go Manifest Guard 승인 또는 거부</w:t>
       </w:r>
       <w:r>
         <w:br/>
@@ -713,17 +746,26 @@
         <w:pStyle w:val="BodyText"/>
       </w:pPr>
       <w:r>
-        <w:t xml:space="preserve">LLM의 출력은 최종 사실이 아니라 후보 계획입니다. Go Guard를 통과한 요구 envelope만 AppDeploy로 전달됩니다.</w:t>
+        <w:t xml:space="preserve">LLM의 출력은 최종 사실이 아니라 후보 계획입니다. 두 Go Guard를 모두 통과한 요구 envelope만 AppDeploy로 전달됩니다.</w:t>
       </w:r>
     </w:p>
     <w:bookmarkEnd w:id="16"/>
-    <w:bookmarkStart w:id="17" w:name="go-guard-정책"/>
+    <w:bookmarkStart w:id="19" w:name="이중-go-guard-정책"/>
     <w:p>
       <w:pPr>
         <w:pStyle w:val="Heading2"/>
       </w:pPr>
       <w:r>
-        <w:t xml:space="preserve">6. Go Guard 정책</w:t>
+        <w:t xml:space="preserve">6. 이중 Go Guard 정책</w:t>
+      </w:r>
+    </w:p>
+    <w:bookmarkStart w:id="17" w:name="go-request-guard"/>
+    <w:p>
+      <w:pPr>
+        <w:pStyle w:val="Heading3"/>
+      </w:pPr>
+      <w:r>
+        <w:t xml:space="preserve">6.1 Go Request Guard</w:t>
       </w:r>
     </w:p>
     <w:p>
@@ -735,28 +777,7 @@
         </w:numPr>
       </w:pPr>
       <w:r>
-        <w:rPr>
-          <w:rStyle w:val="VerbatimChar"/>
-        </w:rPr>
-        <w:t xml:space="preserve">schema_version</w:t>
-      </w:r>
-      <w:r>
-        <w:t xml:space="preserve">과</w:t>
-      </w:r>
-      <w:r>
-        <w:t xml:space="preserve"> </w:t>
-      </w:r>
-      <w:r>
-        <w:rPr>
-          <w:rStyle w:val="VerbatimChar"/>
-        </w:rPr>
-        <w:t xml:space="preserve">kind</w:t>
-      </w:r>
-      <w:r>
-        <w:t xml:space="preserve"> </w:t>
-      </w:r>
-      <w:r>
-        <w:t xml:space="preserve">고정</w:t>
+        <w:t xml:space="preserve">자연어 요구, App Version, LLM candidate 필수값 확인</w:t>
       </w:r>
     </w:p>
     <w:p>
@@ -768,19 +789,7 @@
         </w:numPr>
       </w:pPr>
       <w:r>
-        <w:t xml:space="preserve">요청의</w:t>
-      </w:r>
-      <w:r>
-        <w:t xml:space="preserve"> </w:t>
-      </w:r>
-      <w:r>
-        <w:rPr>
-          <w:rStyle w:val="VerbatimChar"/>
-        </w:rPr>
-        <w:t xml:space="preserve">app_version_id</w:t>
-      </w:r>
-      <w:r>
-        <w:t xml:space="preserve">와 선택적 Target hint 변조 방지</w:t>
+        <w:t xml:space="preserve">요청 길이와 요청자 allowlist 확인</w:t>
       </w:r>
     </w:p>
     <w:p>
@@ -792,7 +801,7 @@
         </w:numPr>
       </w:pPr>
       <w:r>
-        <w:t xml:space="preserve">CPU/GPU 정수와 memory/storage 단위 검증</w:t>
+        <w:t xml:space="preserve">1차년도 VM 범위를 벗어나는 Kubernetes·컨테이너·shell 실행 요청 거부</w:t>
       </w:r>
     </w:p>
     <w:p>
@@ -804,7 +813,17 @@
         </w:numPr>
       </w:pPr>
       <w:r>
-        <w:t xml:space="preserve">accelerator와 GPU 개수 조합 검증</w:t>
+        <w:t xml:space="preserve">password, token, credential, private key, API key 유사 파라미터 거부</w:t>
+      </w:r>
+    </w:p>
+    <w:bookmarkEnd w:id="17"/>
+    <w:bookmarkStart w:id="18" w:name="go-manifest-guard"/>
+    <w:p>
+      <w:pPr>
+        <w:pStyle w:val="Heading3"/>
+      </w:pPr>
+      <w:r>
+        <w:t xml:space="preserve">6.2 Go Manifest Guard</w:t>
       </w:r>
     </w:p>
     <w:p>
@@ -812,11 +831,32 @@
         <w:pStyle w:val="Compact"/>
         <w:numPr>
           <w:ilvl w:val="0"/>
-          <w:numId w:val="1001"/>
+          <w:numId w:val="1002"/>
         </w:numPr>
       </w:pPr>
       <w:r>
-        <w:t xml:space="preserve">알 수 없는 필드와 복수 JSON 객체 거부</w:t>
+        <w:rPr>
+          <w:rStyle w:val="VerbatimChar"/>
+        </w:rPr>
+        <w:t xml:space="preserve">schema_version</w:t>
+      </w:r>
+      <w:r>
+        <w:t xml:space="preserve">과</w:t>
+      </w:r>
+      <w:r>
+        <w:t xml:space="preserve"> </w:t>
+      </w:r>
+      <w:r>
+        <w:rPr>
+          <w:rStyle w:val="VerbatimChar"/>
+        </w:rPr>
+        <w:t xml:space="preserve">kind</w:t>
+      </w:r>
+      <w:r>
+        <w:t xml:space="preserve"> </w:t>
+      </w:r>
+      <w:r>
+        <w:t xml:space="preserve">고정</w:t>
       </w:r>
     </w:p>
     <w:p>
@@ -824,10 +864,70 @@
         <w:pStyle w:val="Compact"/>
         <w:numPr>
           <w:ilvl w:val="0"/>
-          <w:numId w:val="1001"/>
+          <w:numId w:val="1002"/>
         </w:numPr>
       </w:pPr>
       <w:r>
+        <w:t xml:space="preserve">요청의</w:t>
+      </w:r>
+      <w:r>
+        <w:t xml:space="preserve"> </w:t>
+      </w:r>
+      <w:r>
+        <w:rPr>
+          <w:rStyle w:val="VerbatimChar"/>
+        </w:rPr>
+        <w:t xml:space="preserve">app_version_id</w:t>
+      </w:r>
+      <w:r>
+        <w:t xml:space="preserve">와 선택적 Target hint 변조 방지</w:t>
+      </w:r>
+    </w:p>
+    <w:p>
+      <w:pPr>
+        <w:pStyle w:val="Compact"/>
+        <w:numPr>
+          <w:ilvl w:val="0"/>
+          <w:numId w:val="1002"/>
+        </w:numPr>
+      </w:pPr>
+      <w:r>
+        <w:t xml:space="preserve">CPU/GPU 정수와 memory/storage 단위 검증</w:t>
+      </w:r>
+    </w:p>
+    <w:p>
+      <w:pPr>
+        <w:pStyle w:val="Compact"/>
+        <w:numPr>
+          <w:ilvl w:val="0"/>
+          <w:numId w:val="1002"/>
+        </w:numPr>
+      </w:pPr>
+      <w:r>
+        <w:t xml:space="preserve">accelerator와 GPU 개수 조합 검증</w:t>
+      </w:r>
+    </w:p>
+    <w:p>
+      <w:pPr>
+        <w:pStyle w:val="Compact"/>
+        <w:numPr>
+          <w:ilvl w:val="0"/>
+          <w:numId w:val="1002"/>
+        </w:numPr>
+      </w:pPr>
+      <w:r>
+        <w:t xml:space="preserve">알 수 없는 필드와 복수 JSON 객체 거부</w:t>
+      </w:r>
+    </w:p>
+    <w:p>
+      <w:pPr>
+        <w:pStyle w:val="Compact"/>
+        <w:numPr>
+          <w:ilvl w:val="0"/>
+          <w:numId w:val="1002"/>
+        </w:numPr>
+      </w:pPr>
+      <w:r>
         <w:t xml:space="preserve">password, token, credential, private key, API key 유사 파라미터 거부</w:t>
       </w:r>
     </w:p>
@@ -839,8 +939,9 @@
         <w:t xml:space="preserve">검증 실패 시 AppDeploy API를 호출하지 않습니다. LLM 오류를 규칙 기반 성공 결과로 대체하지 않습니다.</w:t>
       </w:r>
     </w:p>
-    <w:bookmarkEnd w:id="17"/>
-    <w:bookmarkStart w:id="18" w:name="상태-확인과-재시도"/>
+    <w:bookmarkEnd w:id="18"/>
+    <w:bookmarkEnd w:id="19"/>
+    <w:bookmarkStart w:id="20" w:name="상태-확인과-재시도"/>
     <w:p>
       <w:pPr>
         <w:pStyle w:val="Heading2"/>
@@ -951,8 +1052,8 @@
         <w:t xml:space="preserve">가 명시된 오류만 재시도 가능으로 판단하고, 배포 생성 POST는 자동 반복하지 않습니다.</w:t>
       </w:r>
     </w:p>
-    <w:bookmarkEnd w:id="18"/>
-    <w:bookmarkStart w:id="19" w:name="구현-위치"/>
+    <w:bookmarkEnd w:id="20"/>
+    <w:bookmarkStart w:id="21" w:name="구현-위치"/>
     <w:p>
       <w:pPr>
         <w:pStyle w:val="Heading2"/>
@@ -1007,7 +1108,46 @@
               <w:pStyle w:val="Compact"/>
             </w:pPr>
             <w:r>
-              <w:t xml:space="preserve">Manifest 모델·Go Guard</w:t>
+              <w:t xml:space="preserve">요청 Guard·정책</w:t>
+            </w:r>
+          </w:p>
+        </w:tc>
+        <w:tc>
+          <w:tcPr/>
+          <w:p>
+            <w:pPr>
+              <w:pStyle w:val="Compact"/>
+            </w:pPr>
+            <w:r>
+              <w:rPr>
+                <w:rStyle w:val="VerbatimChar"/>
+              </w:rPr>
+              <w:t xml:space="preserve">go/service-control-api/internal/plannerguard/</w:t>
+            </w:r>
+            <w:r>
+              <w:t xml:space="preserve">,</w:t>
+            </w:r>
+            <w:r>
+              <w:t xml:space="preserve"> </w:t>
+            </w:r>
+            <w:r>
+              <w:rPr>
+                <w:rStyle w:val="VerbatimChar"/>
+              </w:rPr>
+              <w:t xml:space="preserve">config/planner_guard_policy.json</w:t>
+            </w:r>
+          </w:p>
+        </w:tc>
+      </w:tr>
+      <w:tr>
+        <w:tc>
+          <w:tcPr/>
+          <w:p>
+            <w:pPr>
+              <w:pStyle w:val="Compact"/>
+            </w:pPr>
+            <w:r>
+              <w:t xml:space="preserve">Manifest 모델·Guard</w:t>
             </w:r>
           </w:p>
         </w:tc>
@@ -1174,8 +1314,8 @@
         </w:tc>
       </w:tr>
     </w:tbl>
-    <w:bookmarkEnd w:id="19"/>
-    <w:bookmarkStart w:id="20" w:name="실행-예시"/>
+    <w:bookmarkEnd w:id="21"/>
+    <w:bookmarkStart w:id="22" w:name="실행-예시"/>
     <w:p>
       <w:pPr>
         <w:pStyle w:val="Heading2"/>
@@ -1249,6 +1389,15 @@
         <w:rPr>
           <w:rStyle w:val="VerbatimChar"/>
         </w:rPr>
+        <w:t xml:space="preserve">  --guard-policy ../../config/planner_guard_policy.json \</w:t>
+      </w:r>
+      <w:r>
+        <w:br/>
+      </w:r>
+      <w:r>
+        <w:rPr>
+          <w:rStyle w:val="VerbatimChar"/>
+        </w:rPr>
         <w:t xml:space="preserve">  --appdeploy-base-url http://127.0.0.1:8081/api/v1</w:t>
       </w:r>
     </w:p>
@@ -1260,8 +1409,8 @@
         <w:t xml:space="preserve">실제 성공 결과를 얻으려면 LLM endpoint와 AppDeploy 서버가 모두 실행 중이고 App Version 및 Target Profile이 AppDeploy에 등록되어 있어야 합니다.</w:t>
       </w:r>
     </w:p>
-    <w:bookmarkEnd w:id="20"/>
-    <w:bookmarkStart w:id="21" w:name="범위와-한계"/>
+    <w:bookmarkEnd w:id="22"/>
+    <w:bookmarkStart w:id="23" w:name="범위와-한계"/>
     <w:p>
       <w:pPr>
         <w:pStyle w:val="Heading2"/>
@@ -1275,7 +1424,7 @@
         <w:pStyle w:val="Compact"/>
         <w:numPr>
           <w:ilvl w:val="0"/>
-          <w:numId w:val="1002"/>
+          <w:numId w:val="1003"/>
         </w:numPr>
       </w:pPr>
       <w:r>
@@ -1287,7 +1436,7 @@
         <w:pStyle w:val="Compact"/>
         <w:numPr>
           <w:ilvl w:val="0"/>
-          <w:numId w:val="1002"/>
+          <w:numId w:val="1003"/>
         </w:numPr>
       </w:pPr>
       <w:r>
@@ -1299,7 +1448,7 @@
         <w:pStyle w:val="Compact"/>
         <w:numPr>
           <w:ilvl w:val="0"/>
-          <w:numId w:val="1002"/>
+          <w:numId w:val="1003"/>
         </w:numPr>
       </w:pPr>
       <w:r>
@@ -1311,19 +1460,21 @@
         <w:pStyle w:val="Compact"/>
         <w:numPr>
           <w:ilvl w:val="0"/>
-          <w:numId w:val="1002"/>
+          <w:numId w:val="1003"/>
         </w:numPr>
       </w:pPr>
       <w:r>
         <w:t xml:space="preserve">1차년도 범위는 VM 기반이며 Kubernetes 배포를 산출물로 주장하지 않습니다.</w:t>
       </w:r>
     </w:p>
-    <w:bookmarkEnd w:id="21"/>
-    <w:bookmarkEnd w:id="22"/>
+    <w:bookmarkEnd w:id="23"/>
+    <w:bookmarkEnd w:id="24"/>
     <w:sectPr>
       <w:footnotePr>
         <w:numRestart w:val="eachSect"/>
       </w:footnotePr>
+      <w:pgSz w:w="11906" w:h="16838"/>
+      <w:pgMar w:top="1440" w:bottom="1440" w:left="1440" w:right="1440"/>
     </w:sectPr>
   </w:body>
 </w:document>
@@ -1652,6 +1803,36 @@
     </w:lvlOverride>
   </w:num>
   <w:num w:numId="1002">
+    <w:abstractNumId w:val="99411"/>
+    <w:lvlOverride w:ilvl="0">
+      <w:startOverride w:val="1"/>
+    </w:lvlOverride>
+    <w:lvlOverride w:ilvl="1">
+      <w:startOverride w:val="1"/>
+    </w:lvlOverride>
+    <w:lvlOverride w:ilvl="2">
+      <w:startOverride w:val="1"/>
+    </w:lvlOverride>
+    <w:lvlOverride w:ilvl="3">
+      <w:startOverride w:val="1"/>
+    </w:lvlOverride>
+    <w:lvlOverride w:ilvl="4">
+      <w:startOverride w:val="1"/>
+    </w:lvlOverride>
+    <w:lvlOverride w:ilvl="5">
+      <w:startOverride w:val="1"/>
+    </w:lvlOverride>
+    <w:lvlOverride w:ilvl="6">
+      <w:startOverride w:val="1"/>
+    </w:lvlOverride>
+    <w:lvlOverride w:ilvl="7">
+      <w:startOverride w:val="1"/>
+    </w:lvlOverride>
+    <w:lvlOverride w:ilvl="8">
+      <w:startOverride w:val="1"/>
+    </w:lvlOverride>
+  </w:num>
+  <w:num w:numId="1003">
     <w:abstractNumId w:val="991"/>
   </w:num>
 </w:numbering>

</xml_diff>